<commit_message>
fix(document-engine): templates the in-app editor can open, without a fonts warning
The last sweep of the import now makes a picture that floats at the left between two lines a
character, which is what kept the general training material from opening in the editor, and
replaces LibreOffice's own fonts in the style defaults with the house font, which no text
used and viewers warned about. `--sweep` runs that pass alone over the existing templates.

All 23 templates were swept. Page counts are unchanged; one page of the general training
material differs by a few pixels.

Claude-Session: https://claude.ai/code/session_019fFLd3rEWZKkUNU1RuQAwk
</commit_message>
<xml_diff>
--- a/packages/document-engine/templates/1.0_cover_decisions.docx
+++ b/packages/document-engine/templates/1.0_cover_decisions.docx
@@ -624,7 +624,7 @@
   <w:docDefaults>
     <w:rPrDefault>
       <w:rPr>
-        <w:rFonts w:ascii="Liberation Serif" w:hAnsi="Liberation Serif" w:eastAsia="Noto Serif CJK SC" w:cs="Noto Sans Devanagari"/>
+        <w:rFonts w:ascii="Arial" w:hAnsi="Arial" w:eastAsia="Arial" w:cs="Arial"/>
         <w:kern w:val="2"/>
         <w:sz w:val="24"/>
         <w:szCs w:val="24"/>
@@ -646,7 +646,7 @@
       <w:bidi w:val="0"/>
     </w:pPr>
     <w:rPr>
-      <w:rFonts w:ascii="Liberation Serif" w:hAnsi="Liberation Serif" w:eastAsia="Noto Serif CJK SC" w:cs="Noto Sans Devanagari"/>
+      <w:rFonts w:ascii="Arial" w:hAnsi="Arial" w:eastAsia="Arial" w:cs="Arial"/>
       <w:color w:val="auto"/>
       <w:kern w:val="2"/>
       <w:sz w:val="24"/>
@@ -664,7 +664,7 @@
       <w:spacing w:before="240" w:after="120"/>
     </w:pPr>
     <w:rPr>
-      <w:rFonts w:ascii="Liberation Sans" w:hAnsi="Liberation Sans" w:eastAsia="Noto Sans CJK SC" w:cs="Noto Sans Devanagari"/>
+      <w:rFonts w:ascii="Arial" w:hAnsi="Arial" w:eastAsia="Arial" w:cs="Arial"/>
       <w:sz w:val="28"/>
       <w:szCs w:val="28"/>
     </w:rPr>
@@ -682,7 +682,7 @@
     <w:basedOn w:val="BodyText"/>
     <w:pPr/>
     <w:rPr>
-      <w:rFonts w:cs="Noto Sans Devanagari"/>
+      <w:rFonts w:cs="Arial"/>
     </w:rPr>
   </w:style>
   <w:style w:type="paragraph" w:styleId="Caption">
@@ -694,7 +694,7 @@
       <w:spacing w:before="120" w:after="120"/>
     </w:pPr>
     <w:rPr>
-      <w:rFonts w:cs="Noto Sans Devanagari"/>
+      <w:rFonts w:cs="Arial"/>
       <w:i/>
       <w:iCs/>
       <w:sz w:val="24"/>
@@ -709,7 +709,7 @@
       <w:suppressLineNumbers/>
     </w:pPr>
     <w:rPr>
-      <w:rFonts w:cs="Noto Sans Devanagari"/>
+      <w:rFonts w:cs="Arial"/>
     </w:rPr>
   </w:style>
   <w:style w:type="paragraph" w:styleId="TableContents">

</xml_diff>

<commit_message>
feat: decision 1.5 on the workers' representatives, generated from 10 employees
</commit_message>
<xml_diff>
--- a/packages/document-engine/templates/1.0_cover_decisions.docx
+++ b/packages/document-engine/templates/1.0_cover_decisions.docx
@@ -216,6 +216,87 @@
           <w:lang w:val="ro-RO"/>
         </w:rPr>
         <w:t>4. Numirea lucrătorilor desemnați cu luarea măsurilor în caz de pericol grav și iminent.</w:t>
+      </w:r>
+    </w:p>
+    <w:p>
+      <w:pPr>
+        <w:pStyle w:val="Normal"/>
+        <w:keepNext w:val="false"/>
+        <w:bidi w:val="0"/>
+        <w:spacing w:before="0" w:after="0"/>
+        <w:ind w:hanging="0" w:left="0"/>
+        <w:jc w:val="left"/>
+        <w:rPr>
+          <w:rFonts w:ascii="Arial" w:hAnsi="Arial" w:eastAsia="Arial" w:cs="Arial"/>
+          <w:b w:val="false"/>
+          <w:i w:val="false"/>
+          <w:sz w:val="20"/>
+          <w:lang w:val="ro-RO"/>
+        </w:rPr>
+      </w:pPr>
+      <w:r>
+        <w:rPr>
+          <w:rFonts w:eastAsia="Arial" w:cs="Arial" w:ascii="Arial" w:hAnsi="Arial"/>
+          <w:b w:val="false"/>
+          <w:i w:val="false"/>
+          <w:sz w:val="20"/>
+          <w:lang w:val="ro-RO"/>
+        </w:rPr>
+        <w:t>{{#workersRepresentativeDecision}}</w:t>
+      </w:r>
+    </w:p>
+    <w:p>
+      <w:pPr>
+        <w:pStyle w:val="Normal"/>
+        <w:keepNext w:val="false"/>
+        <w:bidi w:val="0"/>
+        <w:spacing w:before="0" w:after="60"/>
+        <w:ind w:hanging="360" w:left="720"/>
+        <w:jc w:val="left"/>
+        <w:rPr>
+          <w:rFonts w:ascii="Arial" w:hAnsi="Arial" w:eastAsia="Arial" w:cs="Arial"/>
+          <w:b w:val="false"/>
+          <w:i w:val="false"/>
+          <w:sz w:val="20"/>
+          <w:lang w:val="ro-RO"/>
+        </w:rPr>
+      </w:pPr>
+      <w:r>
+        <w:rPr>
+          <w:rFonts w:eastAsia="Arial" w:cs="Arial" w:ascii="Arial" w:hAnsi="Arial"/>
+          <w:b w:val="false"/>
+          <w:i w:val="false"/>
+          <w:sz w:val="20"/>
+          <w:lang w:val="ro-RO"/>
+        </w:rPr>
+        <w:t>5. Desemnarea reprezentanților lucrătorilor cu răspunderi specifice în domeniul securității și sănătății în muncă.</w:t>
+      </w:r>
+    </w:p>
+    <w:p>
+      <w:pPr>
+        <w:pStyle w:val="Normal"/>
+        <w:keepNext w:val="false"/>
+        <w:bidi w:val="0"/>
+        <w:spacing w:before="0" w:after="0"/>
+        <w:ind w:hanging="0" w:left="0"/>
+        <w:jc w:val="left"/>
+        <w:rPr>
+          <w:rFonts w:ascii="Arial" w:hAnsi="Arial" w:eastAsia="Arial" w:cs="Arial"/>
+          <w:b w:val="false"/>
+          <w:i w:val="false"/>
+          <w:sz w:val="20"/>
+          <w:lang w:val="ro-RO"/>
+        </w:rPr>
+      </w:pPr>
+      <w:r>
+        <w:rPr>
+          <w:rFonts w:eastAsia="Arial" w:cs="Arial" w:ascii="Arial" w:hAnsi="Arial"/>
+          <w:b w:val="false"/>
+          <w:i w:val="false"/>
+          <w:sz w:val="20"/>
+          <w:lang w:val="ro-RO"/>
+        </w:rPr>
+        <w:t>{{/workersRepresentativeDecision}}</w:t>
       </w:r>
     </w:p>
     <w:p>

</xml_diff>

<commit_message>
fix(templates): decision 1.5 reads properly, and every cover 1.0 item ends with ";"
Decision 1.5: "Numirea reprezentanților … sunt aleși" becomes "Reprezentanții … sunt aleși",
"legii 319/2006" is capitalized, "2 reprezentanți" is spelled out like "un reprezentant", and
"Reprezentant(ii)" is lowercase mid-sentence. No legal content changes.

Cover 1.0: items 4 and 5 end with ";" like the others, so the list reads the same with or
without decision 1.5 and needs no conditional punctuation.

Claude-Session: https://claude.ai/code/session_016t2koBhc5obAEpvxXzXXtH
</commit_message>
<xml_diff>
--- a/packages/document-engine/templates/1.0_cover_decisions.docx
+++ b/packages/document-engine/templates/1.0_cover_decisions.docx
@@ -215,7 +215,7 @@
           <w:sz w:val="20"/>
           <w:lang w:val="ro-RO"/>
         </w:rPr>
-        <w:t>4. Numirea lucrătorilor desemnați cu luarea măsurilor în caz de pericol grav și iminent.</w:t>
+        <w:t>4. Numirea lucrătorilor desemnați cu luarea măsurilor în caz de pericol grav și iminent;</w:t>
       </w:r>
     </w:p>
     <w:p>
@@ -269,7 +269,7 @@
           <w:sz w:val="20"/>
           <w:lang w:val="ro-RO"/>
         </w:rPr>
-        <w:t>5. Desemnarea reprezentanților lucrătorilor cu răspunderi specifice în domeniul securității și sănătății în muncă.</w:t>
+        <w:t>5. Desemnarea reprezentanților lucrătorilor cu răspunderi specifice în domeniul securității și sănătății în muncă;</w:t>
       </w:r>
     </w:p>
     <w:p>

</xml_diff>

<commit_message>
fix(document-engine): the covers' hand-over block starts at one height, with a date line on each side
The builder measures every cover in LibreOffice and gives each the space above the
hand-over heading that puts it 36 pt below the lowest contents of the seven; cover
1.0 keeps a line of the 1.5 item's height when that item is absent. Each side gets
"Data: ____" in a row of its own, and every item of cover 1.0 ends with a full stop.

Claude-Session: https://claude.ai/code/session_01A9qjCHVH6kcDAEKFiJoShR
</commit_message>
<xml_diff>
--- a/packages/document-engine/templates/1.0_cover_decisions.docx
+++ b/packages/document-engine/templates/1.0_cover_decisions.docx
@@ -7,7 +7,7 @@
         <w:pStyle w:val="Normal"/>
         <w:keepNext w:val="false"/>
         <w:bidi w:val="0"/>
-        <w:spacing w:before="0" w:after="0"/>
+        <w:spacing w:lineRule="auto" w:line="240" w:before="0" w:after="0"/>
         <w:ind w:hanging="0" w:left="0"/>
         <w:jc w:val="center"/>
         <w:rPr>
@@ -34,7 +34,7 @@
         <w:pStyle w:val="Normal"/>
         <w:keepNext w:val="true"/>
         <w:bidi w:val="0"/>
-        <w:spacing w:before="2400" w:after="240"/>
+        <w:spacing w:lineRule="auto" w:line="240" w:before="2400" w:after="240"/>
         <w:ind w:hanging="0" w:left="0"/>
         <w:jc w:val="center"/>
         <w:rPr>
@@ -61,7 +61,7 @@
         <w:pStyle w:val="Normal"/>
         <w:keepNext w:val="true"/>
         <w:bidi w:val="0"/>
-        <w:spacing w:before="0" w:after="120"/>
+        <w:spacing w:lineRule="auto" w:line="240" w:before="0" w:after="120"/>
         <w:ind w:hanging="0" w:left="0"/>
         <w:jc w:val="center"/>
         <w:rPr>
@@ -88,7 +88,7 @@
         <w:pStyle w:val="Normal"/>
         <w:keepNext w:val="false"/>
         <w:bidi w:val="0"/>
-        <w:spacing w:before="0" w:after="360"/>
+        <w:spacing w:lineRule="auto" w:line="240" w:before="0" w:after="360"/>
         <w:ind w:hanging="0" w:left="0"/>
         <w:jc w:val="center"/>
         <w:rPr>
@@ -115,7 +115,7 @@
         <w:pStyle w:val="Normal"/>
         <w:keepNext w:val="false"/>
         <w:bidi w:val="0"/>
-        <w:spacing w:before="0" w:after="60"/>
+        <w:spacing w:lineRule="auto" w:line="240" w:before="0" w:after="60"/>
         <w:ind w:hanging="360" w:left="720"/>
         <w:jc w:val="left"/>
         <w:rPr>
@@ -134,15 +134,15 @@
           <w:sz w:val="20"/>
           <w:lang w:val="ro-RO"/>
         </w:rPr>
-        <w:t>1. Efectuarea instruirilor în domeniul securității și sănătății în muncă la personalul angajat;</w:t>
-      </w:r>
-    </w:p>
-    <w:p>
-      <w:pPr>
-        <w:pStyle w:val="Normal"/>
-        <w:keepNext w:val="false"/>
-        <w:bidi w:val="0"/>
-        <w:spacing w:before="0" w:after="60"/>
+        <w:t>1. Efectuarea instruirilor în domeniul securității și sănătății în muncă la personalul angajat.</w:t>
+      </w:r>
+    </w:p>
+    <w:p>
+      <w:pPr>
+        <w:pStyle w:val="Normal"/>
+        <w:keepNext w:val="false"/>
+        <w:bidi w:val="0"/>
+        <w:spacing w:lineRule="auto" w:line="240" w:before="0" w:after="60"/>
         <w:ind w:hanging="360" w:left="720"/>
         <w:jc w:val="left"/>
         <w:rPr>
@@ -161,15 +161,15 @@
           <w:sz w:val="20"/>
           <w:lang w:val="ro-RO"/>
         </w:rPr>
-        <w:t>2. Persoanele care fac parte din echipa de identificare și evaluare a riscurilor de accidentare și îmbolnăvire profesională pentru locurile de muncă încadrate și care desfășoară aceste activități în cadrul orelor de program;</w:t>
-      </w:r>
-    </w:p>
-    <w:p>
-      <w:pPr>
-        <w:pStyle w:val="Normal"/>
-        <w:keepNext w:val="false"/>
-        <w:bidi w:val="0"/>
-        <w:spacing w:before="0" w:after="60"/>
+        <w:t>2. Persoanele care fac parte din echipa de identificare și evaluare a riscurilor de accidentare și îmbolnăvire profesională pentru locurile de muncă încadrate și care desfășoară aceste activități în cadrul orelor de program.</w:t>
+      </w:r>
+    </w:p>
+    <w:p>
+      <w:pPr>
+        <w:pStyle w:val="Normal"/>
+        <w:keepNext w:val="false"/>
+        <w:bidi w:val="0"/>
+        <w:spacing w:lineRule="auto" w:line="240" w:before="0" w:after="60"/>
         <w:ind w:hanging="360" w:left="720"/>
         <w:jc w:val="left"/>
         <w:rPr>
@@ -188,15 +188,15 @@
           <w:sz w:val="20"/>
           <w:lang w:val="ro-RO"/>
         </w:rPr>
-        <w:t>3. Aplicarea măsurilor de prim ajutor la personalul angajat;</w:t>
-      </w:r>
-    </w:p>
-    <w:p>
-      <w:pPr>
-        <w:pStyle w:val="Normal"/>
-        <w:keepNext w:val="false"/>
-        <w:bidi w:val="0"/>
-        <w:spacing w:before="0" w:after="60"/>
+        <w:t>3. Aplicarea măsurilor de prim ajutor la personalul angajat.</w:t>
+      </w:r>
+    </w:p>
+    <w:p>
+      <w:pPr>
+        <w:pStyle w:val="Normal"/>
+        <w:keepNext w:val="false"/>
+        <w:bidi w:val="0"/>
+        <w:spacing w:lineRule="auto" w:line="240" w:before="0" w:after="60"/>
         <w:ind w:hanging="360" w:left="720"/>
         <w:jc w:val="left"/>
         <w:rPr>
@@ -215,15 +215,15 @@
           <w:sz w:val="20"/>
           <w:lang w:val="ro-RO"/>
         </w:rPr>
-        <w:t>4. Numirea lucrătorilor desemnați cu luarea măsurilor în caz de pericol grav și iminent;</w:t>
-      </w:r>
-    </w:p>
-    <w:p>
-      <w:pPr>
-        <w:pStyle w:val="Normal"/>
-        <w:keepNext w:val="false"/>
-        <w:bidi w:val="0"/>
-        <w:spacing w:before="0" w:after="0"/>
+        <w:t>4. Numirea lucrătorilor desemnați cu luarea măsurilor în caz de pericol grav și iminent.</w:t>
+      </w:r>
+    </w:p>
+    <w:p>
+      <w:pPr>
+        <w:pStyle w:val="Normal"/>
+        <w:keepNext w:val="false"/>
+        <w:bidi w:val="0"/>
+        <w:spacing w:lineRule="auto" w:line="240" w:before="0" w:after="0"/>
         <w:ind w:hanging="0" w:left="0"/>
         <w:jc w:val="left"/>
         <w:rPr>
@@ -250,7 +250,7 @@
         <w:pStyle w:val="Normal"/>
         <w:keepNext w:val="false"/>
         <w:bidi w:val="0"/>
-        <w:spacing w:before="0" w:after="60"/>
+        <w:spacing w:lineRule="auto" w:line="240" w:before="0" w:after="60"/>
         <w:ind w:hanging="360" w:left="720"/>
         <w:jc w:val="left"/>
         <w:rPr>
@@ -269,15 +269,15 @@
           <w:sz w:val="20"/>
           <w:lang w:val="ro-RO"/>
         </w:rPr>
-        <w:t>5. Desemnarea reprezentanților lucrătorilor cu răspunderi specifice în domeniul securității și sănătății în muncă;</w:t>
-      </w:r>
-    </w:p>
-    <w:p>
-      <w:pPr>
-        <w:pStyle w:val="Normal"/>
-        <w:keepNext w:val="false"/>
-        <w:bidi w:val="0"/>
-        <w:spacing w:before="0" w:after="0"/>
+        <w:t>5. Desemnarea reprezentanților lucrătorilor cu răspunderi specifice în domeniul securității și sănătății în muncă.</w:t>
+      </w:r>
+    </w:p>
+    <w:p>
+      <w:pPr>
+        <w:pStyle w:val="Normal"/>
+        <w:keepNext w:val="false"/>
+        <w:bidi w:val="0"/>
+        <w:spacing w:lineRule="auto" w:line="240" w:before="0" w:after="0"/>
         <w:ind w:hanging="0" w:left="0"/>
         <w:jc w:val="left"/>
         <w:rPr>
@@ -302,9 +302,89 @@
     <w:p>
       <w:pPr>
         <w:pStyle w:val="Normal"/>
+        <w:keepNext w:val="false"/>
+        <w:bidi w:val="0"/>
+        <w:spacing w:lineRule="auto" w:line="240" w:before="0" w:after="0"/>
+        <w:ind w:hanging="0" w:left="0"/>
+        <w:jc w:val="left"/>
+        <w:rPr>
+          <w:rFonts w:ascii="Arial" w:hAnsi="Arial" w:eastAsia="Arial" w:cs="Arial"/>
+          <w:b w:val="false"/>
+          <w:i w:val="false"/>
+          <w:sz w:val="20"/>
+          <w:lang w:val="ro-RO"/>
+        </w:rPr>
+      </w:pPr>
+      <w:r>
+        <w:rPr>
+          <w:rFonts w:eastAsia="Arial" w:cs="Arial" w:ascii="Arial" w:hAnsi="Arial"/>
+          <w:b w:val="false"/>
+          <w:i w:val="false"/>
+          <w:sz w:val="20"/>
+          <w:lang w:val="ro-RO"/>
+        </w:rPr>
+        <w:t>{{^workersRepresentativeDecision}}</w:t>
+      </w:r>
+    </w:p>
+    <w:p>
+      <w:pPr>
+        <w:pStyle w:val="Normal"/>
+        <w:keepNext w:val="false"/>
+        <w:bidi w:val="0"/>
+        <w:spacing w:lineRule="exact" w:line="520" w:before="0" w:after="0"/>
+        <w:ind w:hanging="0" w:left="0"/>
+        <w:jc w:val="left"/>
+        <w:rPr>
+          <w:rFonts w:ascii="Arial" w:hAnsi="Arial" w:eastAsia="Arial" w:cs="Arial"/>
+          <w:b w:val="false"/>
+          <w:i w:val="false"/>
+          <w:sz w:val="2"/>
+          <w:lang w:val="ro-RO"/>
+        </w:rPr>
+      </w:pPr>
+      <w:r>
+        <w:rPr>
+          <w:rFonts w:eastAsia="Arial" w:cs="Arial" w:ascii="Arial" w:hAnsi="Arial"/>
+          <w:b w:val="false"/>
+          <w:i w:val="false"/>
+          <w:sz w:val="2"/>
+          <w:lang w:val="ro-RO"/>
+        </w:rPr>
+      </w:r>
+    </w:p>
+    <w:p>
+      <w:pPr>
+        <w:pStyle w:val="Normal"/>
+        <w:keepNext w:val="false"/>
+        <w:bidi w:val="0"/>
+        <w:spacing w:lineRule="auto" w:line="240" w:before="0" w:after="0"/>
+        <w:ind w:hanging="0" w:left="0"/>
+        <w:jc w:val="left"/>
+        <w:rPr>
+          <w:rFonts w:ascii="Arial" w:hAnsi="Arial" w:eastAsia="Arial" w:cs="Arial"/>
+          <w:b w:val="false"/>
+          <w:i w:val="false"/>
+          <w:sz w:val="20"/>
+          <w:lang w:val="ro-RO"/>
+        </w:rPr>
+      </w:pPr>
+      <w:r>
+        <w:rPr>
+          <w:rFonts w:eastAsia="Arial" w:cs="Arial" w:ascii="Arial" w:hAnsi="Arial"/>
+          <w:b w:val="false"/>
+          <w:i w:val="false"/>
+          <w:sz w:val="20"/>
+          <w:lang w:val="ro-RO"/>
+        </w:rPr>
+        <w:t>{{/workersRepresentativeDecision}}</w:t>
+      </w:r>
+    </w:p>
+    <w:p>
+      <w:pPr>
+        <w:pStyle w:val="Normal"/>
         <w:keepNext w:val="true"/>
         <w:bidi w:val="0"/>
-        <w:spacing w:before="1440" w:after="120"/>
+        <w:spacing w:lineRule="auto" w:line="240" w:before="720" w:after="120"/>
         <w:ind w:hanging="0" w:left="0"/>
         <w:jc w:val="center"/>
         <w:rPr>
@@ -344,9 +424,7 @@
         <w:gridCol w:w="4678"/>
       </w:tblGrid>
       <w:tr>
-        <w:trPr>
-          <w:cantSplit/>
-        </w:trPr>
+        <w:trPr/>
         <w:tc>
           <w:tcPr>
             <w:tcW w:w="4677" w:type="dxa"/>
@@ -354,118 +432,118 @@
           </w:tcPr>
           <w:p>
             <w:pPr>
-              <w:pStyle w:val="TableContents"/>
+              <w:pStyle w:val="TableHeading"/>
+              <w:keepNext w:val="true"/>
+              <w:bidi w:val="0"/>
+              <w:spacing w:lineRule="auto" w:line="240" w:before="0" w:after="0"/>
+              <w:ind w:hanging="0" w:left="0"/>
+              <w:jc w:val="center"/>
+              <w:rPr>
+                <w:rFonts w:ascii="Arial" w:hAnsi="Arial" w:eastAsia="Arial" w:cs="Arial"/>
+                <w:b w:val="false"/>
+                <w:i w:val="false"/>
+                <w:sz w:val="20"/>
+                <w:lang w:val="ro-RO"/>
+              </w:rPr>
+            </w:pPr>
+            <w:r>
+              <w:rPr>
+                <w:rFonts w:eastAsia="Arial" w:cs="Arial" w:ascii="Arial" w:hAnsi="Arial"/>
+                <w:b w:val="false"/>
+                <w:i w:val="false"/>
+                <w:sz w:val="20"/>
+                <w:lang w:val="ro-RO"/>
+              </w:rPr>
+              <w:t>Am luat la cunoștință</w:t>
+            </w:r>
+          </w:p>
+          <w:p>
+            <w:pPr>
+              <w:pStyle w:val="TableHeading"/>
               <w:keepNext w:val="false"/>
               <w:bidi w:val="0"/>
-              <w:spacing w:before="0" w:after="0"/>
-              <w:ind w:hanging="0" w:left="0"/>
-              <w:jc w:val="center"/>
-              <w:rPr>
-                <w:rFonts w:ascii="Arial" w:hAnsi="Arial" w:eastAsia="Arial" w:cs="Arial"/>
-                <w:b w:val="false"/>
-                <w:i w:val="false"/>
-                <w:sz w:val="20"/>
-                <w:lang w:val="ro-RO"/>
-              </w:rPr>
-            </w:pPr>
-            <w:r>
-              <w:rPr>
-                <w:rFonts w:eastAsia="Arial" w:cs="Arial" w:ascii="Arial" w:hAnsi="Arial"/>
-                <w:b w:val="false"/>
-                <w:i w:val="false"/>
-                <w:sz w:val="20"/>
-                <w:lang w:val="ro-RO"/>
-              </w:rPr>
-              <w:t>Am luat la cunoștință</w:t>
-            </w:r>
-          </w:p>
-          <w:p>
-            <w:pPr>
-              <w:pStyle w:val="TableContents"/>
+              <w:spacing w:lineRule="auto" w:line="240" w:before="0" w:after="0"/>
+              <w:ind w:hanging="0" w:left="0"/>
+              <w:jc w:val="center"/>
+              <w:rPr>
+                <w:rFonts w:ascii="Arial" w:hAnsi="Arial" w:eastAsia="Arial" w:cs="Arial"/>
+                <w:b w:val="false"/>
+                <w:i w:val="false"/>
+                <w:sz w:val="20"/>
+                <w:lang w:val="ro-RO"/>
+              </w:rPr>
+            </w:pPr>
+            <w:r>
+              <w:rPr>
+                <w:rFonts w:eastAsia="Arial" w:cs="Arial" w:ascii="Arial" w:hAnsi="Arial"/>
+                <w:b w:val="false"/>
+                <w:i w:val="false"/>
+                <w:sz w:val="20"/>
+                <w:lang w:val="ro-RO"/>
+              </w:rPr>
+              <w:t>Am primit un exemplar</w:t>
+            </w:r>
+          </w:p>
+          <w:p>
+            <w:pPr>
+              <w:pStyle w:val="TableHeading"/>
               <w:keepNext w:val="false"/>
               <w:bidi w:val="0"/>
-              <w:spacing w:before="0" w:after="0"/>
-              <w:ind w:hanging="0" w:left="0"/>
-              <w:jc w:val="center"/>
-              <w:rPr>
-                <w:rFonts w:ascii="Arial" w:hAnsi="Arial" w:eastAsia="Arial" w:cs="Arial"/>
-                <w:b w:val="false"/>
-                <w:i w:val="false"/>
-                <w:sz w:val="20"/>
-                <w:lang w:val="ro-RO"/>
-              </w:rPr>
-            </w:pPr>
-            <w:r>
-              <w:rPr>
-                <w:rFonts w:eastAsia="Arial" w:cs="Arial" w:ascii="Arial" w:hAnsi="Arial"/>
-                <w:b w:val="false"/>
-                <w:i w:val="false"/>
-                <w:sz w:val="20"/>
-                <w:lang w:val="ro-RO"/>
-              </w:rPr>
-              <w:t>Am primit un exemplar</w:t>
-            </w:r>
-          </w:p>
-          <w:p>
-            <w:pPr>
-              <w:pStyle w:val="TableContents"/>
+              <w:spacing w:lineRule="auto" w:line="240" w:before="0" w:after="0"/>
+              <w:ind w:hanging="0" w:left="0"/>
+              <w:jc w:val="center"/>
+              <w:rPr>
+                <w:rFonts w:ascii="Arial" w:hAnsi="Arial" w:eastAsia="Arial" w:cs="Arial"/>
+                <w:b w:val="false"/>
+                <w:i w:val="false"/>
+                <w:sz w:val="20"/>
+                <w:lang w:val="ro-RO"/>
+              </w:rPr>
+            </w:pPr>
+            <w:r>
+              <w:rPr>
+                <w:rFonts w:eastAsia="Arial" w:cs="Arial" w:ascii="Arial" w:hAnsi="Arial"/>
+                <w:b w:val="false"/>
+                <w:i w:val="false"/>
+                <w:sz w:val="20"/>
+                <w:lang w:val="ro-RO"/>
+              </w:rPr>
+              <w:t>Aprob documentul</w:t>
+            </w:r>
+          </w:p>
+          <w:p>
+            <w:pPr>
+              <w:pStyle w:val="TableHeading"/>
               <w:keepNext w:val="false"/>
               <w:bidi w:val="0"/>
-              <w:spacing w:before="0" w:after="0"/>
-              <w:ind w:hanging="0" w:left="0"/>
-              <w:jc w:val="center"/>
-              <w:rPr>
-                <w:rFonts w:ascii="Arial" w:hAnsi="Arial" w:eastAsia="Arial" w:cs="Arial"/>
-                <w:b w:val="false"/>
-                <w:i w:val="false"/>
-                <w:sz w:val="20"/>
-                <w:lang w:val="ro-RO"/>
-              </w:rPr>
-            </w:pPr>
-            <w:r>
-              <w:rPr>
-                <w:rFonts w:eastAsia="Arial" w:cs="Arial" w:ascii="Arial" w:hAnsi="Arial"/>
-                <w:b w:val="false"/>
-                <w:i w:val="false"/>
-                <w:sz w:val="20"/>
-                <w:lang w:val="ro-RO"/>
-              </w:rPr>
-              <w:t>Aprob documentul</w:t>
-            </w:r>
-          </w:p>
-          <w:p>
-            <w:pPr>
-              <w:pStyle w:val="TableContents"/>
+              <w:spacing w:lineRule="auto" w:line="240" w:before="840" w:after="0"/>
+              <w:ind w:hanging="0" w:left="0"/>
+              <w:jc w:val="center"/>
+              <w:rPr>
+                <w:rFonts w:ascii="Arial" w:hAnsi="Arial" w:eastAsia="Arial" w:cs="Arial"/>
+                <w:b/>
+                <w:i w:val="false"/>
+                <w:sz w:val="20"/>
+                <w:lang w:val="ro-RO"/>
+              </w:rPr>
+            </w:pPr>
+            <w:r>
+              <w:rPr>
+                <w:rFonts w:eastAsia="Arial" w:cs="Arial" w:ascii="Arial" w:hAnsi="Arial"/>
+                <w:b/>
+                <w:i w:val="false"/>
+                <w:sz w:val="20"/>
+                <w:lang w:val="ro-RO"/>
+              </w:rPr>
+              <w:t>{{client.representativeName}}</w:t>
+            </w:r>
+          </w:p>
+          <w:p>
+            <w:pPr>
+              <w:pStyle w:val="TableHeading"/>
               <w:keepNext w:val="false"/>
               <w:bidi w:val="0"/>
-              <w:spacing w:before="840" w:after="0"/>
-              <w:ind w:hanging="0" w:left="0"/>
-              <w:jc w:val="center"/>
-              <w:rPr>
-                <w:rFonts w:ascii="Arial" w:hAnsi="Arial" w:eastAsia="Arial" w:cs="Arial"/>
-                <w:b/>
-                <w:i w:val="false"/>
-                <w:sz w:val="20"/>
-                <w:lang w:val="ro-RO"/>
-              </w:rPr>
-            </w:pPr>
-            <w:r>
-              <w:rPr>
-                <w:rFonts w:eastAsia="Arial" w:cs="Arial" w:ascii="Arial" w:hAnsi="Arial"/>
-                <w:b/>
-                <w:i w:val="false"/>
-                <w:sz w:val="20"/>
-                <w:lang w:val="ro-RO"/>
-              </w:rPr>
-              <w:t>{{client.representativeName}}</w:t>
-            </w:r>
-          </w:p>
-          <w:p>
-            <w:pPr>
-              <w:pStyle w:val="TableContents"/>
-              <w:keepNext w:val="false"/>
-              <w:bidi w:val="0"/>
-              <w:spacing w:before="0" w:after="0"/>
+              <w:spacing w:lineRule="auto" w:line="240" w:before="0" w:after="0"/>
               <w:ind w:hanging="0" w:left="0"/>
               <w:jc w:val="center"/>
               <w:rPr>
@@ -495,137 +573,206 @@
           </w:tcPr>
           <w:p>
             <w:pPr>
+              <w:pStyle w:val="TableHeading"/>
+              <w:keepNext w:val="false"/>
+              <w:bidi w:val="0"/>
+              <w:spacing w:lineRule="auto" w:line="240" w:before="0" w:after="0"/>
+              <w:ind w:hanging="0" w:left="0"/>
+              <w:jc w:val="center"/>
+              <w:rPr>
+                <w:rFonts w:ascii="Arial" w:hAnsi="Arial" w:eastAsia="Arial" w:cs="Arial"/>
+                <w:b w:val="false"/>
+                <w:i w:val="false"/>
+                <w:sz w:val="20"/>
+                <w:lang w:val="ro-RO"/>
+              </w:rPr>
+            </w:pPr>
+            <w:r>
+              <w:rPr>
+                <w:rFonts w:eastAsia="Arial" w:cs="Arial" w:ascii="Arial" w:hAnsi="Arial"/>
+                <w:b w:val="false"/>
+                <w:i w:val="false"/>
+                <w:sz w:val="20"/>
+                <w:lang w:val="ro-RO"/>
+              </w:rPr>
+              <w:t>Am întocmit documentul</w:t>
+            </w:r>
+          </w:p>
+          <w:p>
+            <w:pPr>
+              <w:pStyle w:val="TableHeading"/>
+              <w:keepNext w:val="false"/>
+              <w:bidi w:val="0"/>
+              <w:spacing w:lineRule="auto" w:line="240" w:before="0" w:after="0"/>
+              <w:ind w:hanging="0" w:left="0"/>
+              <w:jc w:val="center"/>
+              <w:rPr>
+                <w:rFonts w:ascii="Arial" w:hAnsi="Arial" w:eastAsia="Arial" w:cs="Arial"/>
+                <w:b w:val="false"/>
+                <w:i w:val="false"/>
+                <w:sz w:val="20"/>
+                <w:lang w:val="ro-RO"/>
+              </w:rPr>
+            </w:pPr>
+            <w:r>
+              <w:rPr>
+                <w:rFonts w:eastAsia="Arial" w:cs="Arial" w:ascii="Arial" w:hAnsi="Arial"/>
+                <w:b w:val="false"/>
+                <w:i w:val="false"/>
+                <w:sz w:val="20"/>
+                <w:lang w:val="ro-RO"/>
+              </w:rPr>
+              <w:t>Am informat angajatorul</w:t>
+            </w:r>
+          </w:p>
+          <w:p>
+            <w:pPr>
+              <w:pStyle w:val="TableHeading"/>
+              <w:keepNext w:val="false"/>
+              <w:bidi w:val="0"/>
+              <w:spacing w:lineRule="auto" w:line="240" w:before="0" w:after="0"/>
+              <w:ind w:hanging="0" w:left="0"/>
+              <w:jc w:val="center"/>
+              <w:rPr>
+                <w:rFonts w:ascii="Arial" w:hAnsi="Arial" w:eastAsia="Arial" w:cs="Arial"/>
+                <w:b w:val="false"/>
+                <w:i w:val="false"/>
+                <w:sz w:val="20"/>
+                <w:lang w:val="ro-RO"/>
+              </w:rPr>
+            </w:pPr>
+            <w:r>
+              <w:rPr>
+                <w:rFonts w:eastAsia="Arial" w:cs="Arial" w:ascii="Arial" w:hAnsi="Arial"/>
+                <w:b w:val="false"/>
+                <w:i w:val="false"/>
+                <w:sz w:val="20"/>
+                <w:lang w:val="ro-RO"/>
+              </w:rPr>
+              <w:t>Am predat un exemplar</w:t>
+            </w:r>
+          </w:p>
+          <w:p>
+            <w:pPr>
+              <w:pStyle w:val="TableHeading"/>
+              <w:keepNext w:val="false"/>
+              <w:bidi w:val="0"/>
+              <w:spacing w:lineRule="auto" w:line="240" w:before="840" w:after="0"/>
+              <w:ind w:hanging="0" w:left="0"/>
+              <w:jc w:val="center"/>
+              <w:rPr>
+                <w:rFonts w:ascii="Arial" w:hAnsi="Arial" w:eastAsia="Arial" w:cs="Arial"/>
+                <w:b/>
+                <w:i w:val="false"/>
+                <w:sz w:val="20"/>
+                <w:lang w:val="ro-RO"/>
+              </w:rPr>
+            </w:pPr>
+            <w:r>
+              <w:rPr>
+                <w:rFonts w:eastAsia="Arial" w:cs="Arial" w:ascii="Arial" w:hAnsi="Arial"/>
+                <w:b/>
+                <w:i w:val="false"/>
+                <w:sz w:val="20"/>
+                <w:lang w:val="ro-RO"/>
+              </w:rPr>
+              <w:t>{{provider.representativeName}}</w:t>
+            </w:r>
+          </w:p>
+          <w:p>
+            <w:pPr>
+              <w:pStyle w:val="TableHeading"/>
+              <w:keepNext w:val="false"/>
+              <w:bidi w:val="0"/>
+              <w:spacing w:lineRule="auto" w:line="240" w:before="0" w:after="0"/>
+              <w:ind w:hanging="0" w:left="0"/>
+              <w:jc w:val="center"/>
+              <w:rPr>
+                <w:rFonts w:ascii="Arial" w:hAnsi="Arial" w:eastAsia="Arial" w:cs="Arial"/>
+                <w:b w:val="false"/>
+                <w:i w:val="false"/>
+                <w:sz w:val="20"/>
+                <w:lang w:val="ro-RO"/>
+              </w:rPr>
+            </w:pPr>
+            <w:r>
+              <w:rPr>
+                <w:rFonts w:eastAsia="Arial" w:cs="Arial" w:ascii="Arial" w:hAnsi="Arial"/>
+                <w:b w:val="false"/>
+                <w:i w:val="false"/>
+                <w:sz w:val="20"/>
+                <w:lang w:val="ro-RO"/>
+              </w:rPr>
+              <w:t>{{provider.representativeRole}} al {{provider.legalName}}</w:t>
+            </w:r>
+          </w:p>
+        </w:tc>
+      </w:tr>
+      <w:tr>
+        <w:trPr/>
+        <w:tc>
+          <w:tcPr>
+            <w:tcW w:w="4677" w:type="dxa"/>
+            <w:tcBorders/>
+          </w:tcPr>
+          <w:p>
+            <w:pPr>
               <w:pStyle w:val="TableContents"/>
               <w:keepNext w:val="false"/>
               <w:bidi w:val="0"/>
-              <w:spacing w:before="0" w:after="0"/>
-              <w:ind w:hanging="0" w:left="0"/>
-              <w:jc w:val="center"/>
-              <w:rPr>
-                <w:rFonts w:ascii="Arial" w:hAnsi="Arial" w:eastAsia="Arial" w:cs="Arial"/>
-                <w:b w:val="false"/>
-                <w:i w:val="false"/>
-                <w:sz w:val="20"/>
-                <w:lang w:val="ro-RO"/>
-              </w:rPr>
-            </w:pPr>
-            <w:r>
-              <w:rPr>
-                <w:rFonts w:eastAsia="Arial" w:cs="Arial" w:ascii="Arial" w:hAnsi="Arial"/>
-                <w:b w:val="false"/>
-                <w:i w:val="false"/>
-                <w:sz w:val="20"/>
-                <w:lang w:val="ro-RO"/>
-              </w:rPr>
-              <w:t>Am întocmit documentul</w:t>
-            </w:r>
-          </w:p>
+              <w:spacing w:lineRule="auto" w:line="240" w:before="240" w:after="0"/>
+              <w:ind w:hanging="0" w:left="0"/>
+              <w:jc w:val="center"/>
+              <w:rPr>
+                <w:rFonts w:ascii="Arial" w:hAnsi="Arial" w:eastAsia="Arial" w:cs="Arial"/>
+                <w:b w:val="false"/>
+                <w:i w:val="false"/>
+                <w:sz w:val="20"/>
+                <w:lang w:val="ro-RO"/>
+              </w:rPr>
+            </w:pPr>
+            <w:r>
+              <w:rPr>
+                <w:rFonts w:eastAsia="Arial" w:cs="Arial" w:ascii="Arial" w:hAnsi="Arial"/>
+                <w:b w:val="false"/>
+                <w:i w:val="false"/>
+                <w:sz w:val="20"/>
+                <w:lang w:val="ro-RO"/>
+              </w:rPr>
+              <w:t>Data: ____________________</w:t>
+            </w:r>
+          </w:p>
+        </w:tc>
+        <w:tc>
+          <w:tcPr>
+            <w:tcW w:w="4678" w:type="dxa"/>
+            <w:tcBorders/>
+          </w:tcPr>
           <w:p>
             <w:pPr>
               <w:pStyle w:val="TableContents"/>
               <w:keepNext w:val="false"/>
               <w:bidi w:val="0"/>
-              <w:spacing w:before="0" w:after="0"/>
-              <w:ind w:hanging="0" w:left="0"/>
-              <w:jc w:val="center"/>
-              <w:rPr>
-                <w:rFonts w:ascii="Arial" w:hAnsi="Arial" w:eastAsia="Arial" w:cs="Arial"/>
-                <w:b w:val="false"/>
-                <w:i w:val="false"/>
-                <w:sz w:val="20"/>
-                <w:lang w:val="ro-RO"/>
-              </w:rPr>
-            </w:pPr>
-            <w:r>
-              <w:rPr>
-                <w:rFonts w:eastAsia="Arial" w:cs="Arial" w:ascii="Arial" w:hAnsi="Arial"/>
-                <w:b w:val="false"/>
-                <w:i w:val="false"/>
-                <w:sz w:val="20"/>
-                <w:lang w:val="ro-RO"/>
-              </w:rPr>
-              <w:t>Am informat angajatorul</w:t>
-            </w:r>
-          </w:p>
-          <w:p>
-            <w:pPr>
-              <w:pStyle w:val="TableContents"/>
-              <w:keepNext w:val="false"/>
-              <w:bidi w:val="0"/>
-              <w:spacing w:before="0" w:after="0"/>
-              <w:ind w:hanging="0" w:left="0"/>
-              <w:jc w:val="center"/>
-              <w:rPr>
-                <w:rFonts w:ascii="Arial" w:hAnsi="Arial" w:eastAsia="Arial" w:cs="Arial"/>
-                <w:b w:val="false"/>
-                <w:i w:val="false"/>
-                <w:sz w:val="20"/>
-                <w:lang w:val="ro-RO"/>
-              </w:rPr>
-            </w:pPr>
-            <w:r>
-              <w:rPr>
-                <w:rFonts w:eastAsia="Arial" w:cs="Arial" w:ascii="Arial" w:hAnsi="Arial"/>
-                <w:b w:val="false"/>
-                <w:i w:val="false"/>
-                <w:sz w:val="20"/>
-                <w:lang w:val="ro-RO"/>
-              </w:rPr>
-              <w:t>Am predat un exemplar</w:t>
-            </w:r>
-          </w:p>
-          <w:p>
-            <w:pPr>
-              <w:pStyle w:val="TableContents"/>
-              <w:keepNext w:val="false"/>
-              <w:bidi w:val="0"/>
-              <w:spacing w:before="840" w:after="0"/>
-              <w:ind w:hanging="0" w:left="0"/>
-              <w:jc w:val="center"/>
-              <w:rPr>
-                <w:rFonts w:ascii="Arial" w:hAnsi="Arial" w:eastAsia="Arial" w:cs="Arial"/>
-                <w:b/>
-                <w:i w:val="false"/>
-                <w:sz w:val="20"/>
-                <w:lang w:val="ro-RO"/>
-              </w:rPr>
-            </w:pPr>
-            <w:r>
-              <w:rPr>
-                <w:rFonts w:eastAsia="Arial" w:cs="Arial" w:ascii="Arial" w:hAnsi="Arial"/>
-                <w:b/>
-                <w:i w:val="false"/>
-                <w:sz w:val="20"/>
-                <w:lang w:val="ro-RO"/>
-              </w:rPr>
-              <w:t>{{provider.representativeName}}</w:t>
-            </w:r>
-          </w:p>
-          <w:p>
-            <w:pPr>
-              <w:pStyle w:val="TableContents"/>
-              <w:keepNext w:val="false"/>
-              <w:bidi w:val="0"/>
-              <w:spacing w:before="0" w:after="0"/>
-              <w:ind w:hanging="0" w:left="0"/>
-              <w:jc w:val="center"/>
-              <w:rPr>
-                <w:rFonts w:ascii="Arial" w:hAnsi="Arial" w:eastAsia="Arial" w:cs="Arial"/>
-                <w:b w:val="false"/>
-                <w:i w:val="false"/>
-                <w:sz w:val="20"/>
-                <w:lang w:val="ro-RO"/>
-              </w:rPr>
-            </w:pPr>
-            <w:r>
-              <w:rPr>
-                <w:rFonts w:eastAsia="Arial" w:cs="Arial" w:ascii="Arial" w:hAnsi="Arial"/>
-                <w:b w:val="false"/>
-                <w:i w:val="false"/>
-                <w:sz w:val="20"/>
-                <w:lang w:val="ro-RO"/>
-              </w:rPr>
-              <w:t>{{provider.representativeRole}} al {{provider.legalName}}</w:t>
+              <w:spacing w:lineRule="auto" w:line="240" w:before="240" w:after="0"/>
+              <w:ind w:hanging="0" w:left="0"/>
+              <w:jc w:val="center"/>
+              <w:rPr>
+                <w:rFonts w:ascii="Arial" w:hAnsi="Arial" w:eastAsia="Arial" w:cs="Arial"/>
+                <w:b w:val="false"/>
+                <w:i w:val="false"/>
+                <w:sz w:val="20"/>
+                <w:lang w:val="ro-RO"/>
+              </w:rPr>
+            </w:pPr>
+            <w:r>
+              <w:rPr>
+                <w:rFonts w:eastAsia="Arial" w:cs="Arial" w:ascii="Arial" w:hAnsi="Arial"/>
+                <w:b w:val="false"/>
+                <w:i w:val="false"/>
+                <w:sz w:val="20"/>
+                <w:lang w:val="ro-RO"/>
+              </w:rPr>
+              <w:t>Data: ____________________</w:t>
             </w:r>
           </w:p>
         </w:tc>
@@ -635,7 +782,7 @@
       <w:pPr>
         <w:pStyle w:val="Normal"/>
         <w:bidi w:val="0"/>
-        <w:spacing w:before="0" w:after="0"/>
+        <w:spacing w:lineRule="auto" w:line="240" w:before="0" w:after="0"/>
         <w:ind w:hanging="0" w:left="0"/>
         <w:jc w:val="center"/>
         <w:rPr>
@@ -804,6 +951,19 @@
       <w:suppressLineNumbers/>
     </w:pPr>
     <w:rPr/>
+  </w:style>
+  <w:style w:type="paragraph" w:styleId="TableHeading">
+    <w:name w:val="Table Heading"/>
+    <w:basedOn w:val="TableContents"/>
+    <w:qFormat/>
+    <w:pPr>
+      <w:suppressLineNumbers/>
+      <w:jc w:val="center"/>
+    </w:pPr>
+    <w:rPr>
+      <w:b/>
+      <w:bCs/>
+    </w:rPr>
   </w:style>
   <w:style w:type="paragraph" w:styleId="HeaderandFooter">
     <w:name w:val="Header and Footer"/>

</xml_diff>

<commit_message>
fix(templates): the occupational safety set words its acknowledgement as the fire-safety set does: "Proces-verbal de luare de cunoștință" in the decisions, their text naming "decizia <client> nr. <N> SSM", decision 1's "procesului-verbal de luare de cunoștință", the covers' "Am luat cunoștință" and "predare-primire", "Am luat cunoștință" in the hand-over blocks of 6, 10, 11 and 12, and the own instructions' "procesul-verbal de predare-primire"; edited in the templates and swept, none of which an import reproduces (#417)
</commit_message>
<xml_diff>
--- a/packages/document-engine/templates/1.0_cover_decisions.docx
+++ b/packages/document-engine/templates/1.0_cover_decisions.docx
@@ -403,7 +403,7 @@
           <w:sz w:val="20"/>
           <w:lang w:val="ro-RO"/>
         </w:rPr>
-        <w:t>PERSOANE IMPLICATE ÎN PROCESUL DE PREDARE / PRIMIRE A DOCUMENTULUI</w:t>
+        <w:t>PERSOANE IMPLICATE ÎN PROCESUL DE PREDARE-PRIMIRE A DOCUMENTULUI</w:t>
       </w:r>
     </w:p>
     <w:tbl>
@@ -454,7 +454,7 @@
                 <w:sz w:val="20"/>
                 <w:lang w:val="ro-RO"/>
               </w:rPr>
-              <w:t>Am luat la cunoștință</w:t>
+              <w:t>Am luat cunoștință</w:t>
             </w:r>
           </w:p>
           <w:p>

</xml_diff>